<commit_message>
Revision du cas d'utilisation
</commit_message>
<xml_diff>
--- a/Docs/Analyse Preliminaire Application.docx
+++ b/Docs/Analyse Preliminaire Application.docx
@@ -994,6 +994,7 @@
           <w:sz w:val="36"/>
           <w:szCs w:val="36"/>
         </w:rPr>
+        <w:lastRenderedPageBreak/>
         <w:t xml:space="preserve">    </w:t>
       </w:r>
       <w:bookmarkStart w:id="11" w:name="_Toc222078020"/>
@@ -1591,6 +1592,7 @@
         <w:rPr>
           <w:lang w:val="fr-CA"/>
         </w:rPr>
+        <w:lastRenderedPageBreak/>
         <w:t>3</w:t>
       </w:r>
       <w:r>
@@ -2540,6 +2542,7 @@
           <w:noProof/>
           <w:lang w:val="fr-CA"/>
         </w:rPr>
+        <w:lastRenderedPageBreak/>
         <w:drawing>
           <wp:anchor distT="0" distB="0" distL="114300" distR="114300" simplePos="0" relativeHeight="251658241" behindDoc="0" locked="0" layoutInCell="1" allowOverlap="1" wp14:anchorId="64F6B47C" wp14:editId="277D27E1">
             <wp:simplePos x="0" y="0"/>
@@ -3104,6 +3107,7 @@
           <w:noProof/>
           <w:lang w:val="fr-CA"/>
         </w:rPr>
+        <w:lastRenderedPageBreak/>
         <w:drawing>
           <wp:inline distT="0" distB="0" distL="0" distR="0" wp14:anchorId="163F9683" wp14:editId="207DCCA0">
             <wp:extent cx="3484001" cy="2469823"/>
@@ -3499,6 +3503,7 @@
       <w:bookmarkStart w:id="16" w:name="_Toc220046945"/>
       <w:bookmarkStart w:id="17" w:name="_Toc222078025"/>
       <w:r>
+        <w:lastRenderedPageBreak/>
         <w:t>6</w:t>
       </w:r>
       <w:r>
@@ -3673,6 +3678,7 @@
         <w:rPr>
           <w:noProof/>
         </w:rPr>
+        <w:lastRenderedPageBreak/>
         <w:drawing>
           <wp:inline distT="0" distB="0" distL="0" distR="0" wp14:anchorId="15A70C73" wp14:editId="06072CA0">
             <wp:extent cx="5942598" cy="4380245"/>
@@ -3800,6 +3806,7 @@
         <w:rPr>
           <w:noProof/>
         </w:rPr>
+        <w:lastRenderedPageBreak/>
         <w:drawing>
           <wp:inline distT="0" distB="0" distL="0" distR="0" wp14:anchorId="5CD672CB" wp14:editId="133B101D">
             <wp:extent cx="5943580" cy="4476292"/>
@@ -3930,6 +3937,7 @@
         <w:rPr>
           <w:noProof/>
         </w:rPr>
+        <w:lastRenderedPageBreak/>
         <w:drawing>
           <wp:inline distT="0" distB="0" distL="0" distR="0" wp14:anchorId="3136B3FC" wp14:editId="4AB2F29E">
             <wp:extent cx="4528185" cy="5784112"/>
@@ -4057,6 +4065,7 @@
           <w:iCs/>
           <w:noProof/>
         </w:rPr>
+        <w:lastRenderedPageBreak/>
         <w:drawing>
           <wp:inline distT="0" distB="0" distL="0" distR="0" wp14:anchorId="08A44FE3" wp14:editId="646BCE76">
             <wp:extent cx="4070985" cy="5805377"/>
@@ -4183,6 +4192,7 @@
         <w:rPr>
           <w:noProof/>
         </w:rPr>
+        <w:lastRenderedPageBreak/>
         <w:drawing>
           <wp:inline distT="0" distB="0" distL="0" distR="0" wp14:anchorId="669825B0" wp14:editId="22AADB98">
             <wp:extent cx="4114754" cy="5816009"/>
@@ -4302,6 +4312,7 @@
         <w:rPr>
           <w:noProof/>
         </w:rPr>
+        <w:lastRenderedPageBreak/>
         <w:drawing>
           <wp:inline distT="0" distB="0" distL="0" distR="0" wp14:anchorId="47F5E4A7" wp14:editId="65907E4A">
             <wp:extent cx="2711140" cy="5425118"/>
@@ -4566,6 +4577,7 @@
           <w:bCs/>
           <w:lang w:val="fr-CA"/>
         </w:rPr>
+        <w:lastRenderedPageBreak/>
         <w:t>Extension (Set)</w:t>
       </w:r>
     </w:p>

</xml_diff>